<commit_message>
feat: enforce uppercase text details across kiosk, portal, and admin while preserving credentials and contacts
</commit_message>
<xml_diff>
--- a/public/Barangay-San-Manuel-Permit-Template.docx
+++ b/public/Barangay-San-Manuel-Permit-Template.docx
@@ -130,7 +130,7 @@
         <w:t>TO WHOM IT MAY CONCERN:</w:t>
       </w:r>
     </w:p>
-    <!-- Body Paragraph 1: Authorization -->
+    <!-- Paragraph 1: Authorization -->
     <w:p>
       <w:pPr>
         <w:jc w:val="both"/>
@@ -148,7 +148,7 @@
           <w:b/>
           <w:sz w:val="24"/>
         </w:rPr>
-        <w:t>{{applicant_name}}</w:t>
+        <w:t>{{authorized_entity}}</w:t>
       </w:r>
       <w:r>
         <w:rPr>
@@ -174,26 +174,13 @@
           <w:b/>
           <w:sz w:val="24"/>
         </w:rPr>
-        <w:t>{{activity_type}}</w:t>
+        <w:t>{{purpose}}</w:t>
       </w:r>
       <w:r>
         <w:rPr>
           <w:sz w:val="24"/>
         </w:rPr>
-        <w:t xml:space="preserve"> OF </w:t>
-      </w:r>
-      <w:r>
-        <w:rPr>
-          <w:b/>
-          <w:sz w:val="24"/>
-        </w:rPr>
-        <w:t>{{quantity_description}}</w:t>
-      </w:r>
-      <w:r>
-        <w:rPr>
-          <w:sz w:val="24"/>
-        </w:rPr>
-        <w:t xml:space="preserve"> POLES along </w:t>
+        <w:t xml:space="preserve"> along </w:t>
       </w:r>
       <w:r>
         <w:rPr>
@@ -210,6 +197,7 @@
       </w:r>
       <w:r>
         <w:rPr>
+          <w:b/>
           <w:sz w:val="24"/>
         </w:rPr>
         <w:t>{{subdivision}}</w:t>
@@ -221,7 +209,7 @@
         <w:t>, Barangay San Manuel, San Jose Del Monte Bulacan.</w:t>
       </w:r>
     </w:p>
-    <!-- Body Paragraph 2: Request of -->
+    <!-- Paragraph 2: Request of -->
     <w:p>
       <w:pPr>
         <w:jc w:val="both"/>
@@ -241,8 +229,14 @@
         </w:rPr>
         <w:t>{{requested_by}}</w:t>
       </w:r>
+      <w:r>
+        <w:rPr>
+          <w:sz w:val="24"/>
+        </w:rPr>
+        <w:t>.</w:t>
+      </w:r>
     </w:p>
-    <!-- Body Paragraph 3: Given and signed -->
+    <!-- Paragraph 3: Given and signed -->
     <w:p>
       <w:pPr>
         <w:jc w:val="both"/>
@@ -333,13 +327,13 @@
     </w:p>
     <w:p>
       <w:pPr>
-        <w:spacing w:before="200" w:after="200"/>
+        <w:spacing w:before="150" w:after="150"/>
       </w:pPr>
     </w:p>
     <!-- Metadata Section -->
     <w:p>
       <w:pPr>
-        <w:spacing w:line="280" w:lineRule="auto" w:after="300"/>
+        <w:spacing w:line="280" w:lineRule="auto" w:after="200"/>
       </w:pPr>
       <w:r>
         <w:rPr>
@@ -394,7 +388,7 @@
         <w:rPr>
           <w:sz w:val="20"/>
         </w:rPr>
-        <w:t>{{or_number}}</w:t>
+        <w:t>{{control_number}}</w:t>
       </w:r>
       <w:r>
         <w:rPr>
@@ -408,13 +402,13 @@
         <w:rPr>
           <w:sz w:val="20"/>
         </w:rPr>
-        <w:t>{{or_date}}</w:t>
+        <w:t>{{day}} {{month}}, {{year}}</w:t>
       </w:r>
     </w:p>
     <!-- Legal notes -->
     <w:p>
       <w:pPr>
-        <w:spacing w:line="240" w:lineRule="auto" w:after="300"/>
+        <w:spacing w:line="240" w:lineRule="auto" w:after="200"/>
       </w:pPr>
       <w:r>
         <w:rPr>

</xml_diff>